<commit_message>
docs(axis): explications officielles (help text DC2) + PDF sources
Remplace les interpretations par le texte d'aide OFFICIEL des auteurs (annexe
supplementary material 2 / DC2) pour les 20 items, rendu en francais. Ajoute le
preambule officiel, le cas du recensement, et versionne les 2 PDF sources
(DC1 tables, DC2 help text) dans docs/Analyses/AXIS/. .docx regenere.

Co-Authored-By: Claude Fable 5 <noreply@anthropic.com>
</commit_message>
<xml_diff>
--- a/docs/axis-methodologie.docx
+++ b/docs/axis-methodologie.docx
@@ -28,13 +28,13 @@
         </w:p>
       </w:sdtContent>
     </w:sdt>
-    <w:bookmarkStart w:id="17" w:name="X2692b0311fbc1a79620696e6d63324a1a7d5cbf"/>
+    <w:bookmarkStart w:id="18" w:name="X86d10e3ce897a6eab132cf977c6e779efbdc268"/>
     <w:p>
       <w:pPr>
         <w:pStyle w:val="Heading1"/>
       </w:pPr>
       <w:r>
-        <w:t xml:space="preserve">AXIS — méthodologie de référence (outil d'évaluation critique des études transversales)</w:t>
+        <w:t xml:space="preserve">AXIS — Méthodologie officielle (outil d'évaluation critique des études transversales)</w:t>
       </w:r>
     </w:p>
     <w:p>
@@ -42,81 +42,59 @@
         <w:pStyle w:val="BlockText"/>
       </w:pPr>
       <w:r>
-        <w:t xml:space="preserve">Document de référence compilé pour SciencesWiki (évaluation critique). Sources</w:t>
-      </w:r>
-      <w:r>
-        <w:t xml:space="preserve"> </w:t>
-      </w:r>
-      <w:r>
-        <w:rPr>
-          <w:b/>
-          <w:bCs/>
-        </w:rPr>
-        <w:t xml:space="preserve">officielles</w:t>
-      </w:r>
-      <w:r>
-        <w:t xml:space="preserve"> </w:t>
-      </w:r>
-      <w:r>
-        <w:t xml:space="preserve">citées en bas. La grille et le barème sont reproduits</w:t>
-      </w:r>
-      <w:r>
-        <w:t xml:space="preserve"> </w:t>
-      </w:r>
-      <w:r>
-        <w:rPr>
-          <w:b/>
-          <w:bCs/>
-        </w:rPr>
-        <w:t xml:space="preserve">verbatim</w:t>
-      </w:r>
-      <w:r>
-        <w:t xml:space="preserve"> </w:t>
-      </w:r>
-      <w:r>
-        <w:t xml:space="preserve">du</w:t>
-      </w:r>
-      <w:r>
-        <w:t xml:space="preserve"> </w:t>
-      </w:r>
-      <w:r>
-        <w:t xml:space="preserve">papier ; les « Interprétations » par item sont des notes d'aide</w:t>
-      </w:r>
-      <w:r>
-        <w:t xml:space="preserve"> </w:t>
-      </w:r>
-      <w:r>
-        <w:rPr>
-          <w:b/>
-          <w:bCs/>
-        </w:rPr>
-        <w:t xml:space="preserve">fidèles à la</w:t>
-      </w:r>
-      <w:r>
-        <w:rPr>
-          <w:b/>
-          <w:bCs/>
-        </w:rPr>
-        <w:t xml:space="preserve"> </w:t>
-      </w:r>
-      <w:r>
-        <w:rPr>
-          <w:b/>
-          <w:bCs/>
-        </w:rPr>
-        <w:t xml:space="preserve">méthodologie</w:t>
-      </w:r>
-      <w:r>
-        <w:t xml:space="preserve"> </w:t>
-      </w:r>
-      <w:r>
-        <w:t xml:space="preserve">(le « support document » officiel des auteurs est une annexe BMJ Open</w:t>
-      </w:r>
-      <w:r>
-        <w:t xml:space="preserve"> </w:t>
-      </w:r>
-      <w:r>
-        <w:t xml:space="preserve">non extractible automatiquement — lien plus bas — mais son contenu est standard).</w:t>
+        <w:t xml:space="preserve">Document de référence pour SciencesWiki. La grille des 20 items</w:t>
+      </w:r>
+      <w:r>
+        <w:t xml:space="preserve"> </w:t>
+      </w:r>
+      <w:r>
+        <w:rPr>
+          <w:b/>
+          <w:bCs/>
+        </w:rPr>
+        <w:t xml:space="preserve">et le texte d'aide</w:t>
+      </w:r>
+      <w:r>
+        <w:rPr>
+          <w:b/>
+          <w:bCs/>
+        </w:rPr>
+        <w:t xml:space="preserve"> </w:t>
+      </w:r>
+      <w:r>
+        <w:rPr>
+          <w:b/>
+          <w:bCs/>
+        </w:rPr>
+        <w:t xml:space="preserve">explicatif</w:t>
+      </w:r>
+      <w:r>
+        <w:t xml:space="preserve"> </w:t>
+      </w:r>
+      <w:r>
+        <w:t xml:space="preserve">sont ceux des auteurs (annexe</w:t>
+      </w:r>
+      <w:r>
+        <w:t xml:space="preserve"> </w:t>
+      </w:r>
+      <w:r>
+        <w:rPr>
+          <w:i/>
+          <w:iCs/>
+        </w:rPr>
+        <w:t xml:space="preserve">supplementary material 2</w:t>
+      </w:r>
+      <w:r>
+        <w:t xml:space="preserve"> </w:t>
+      </w:r>
+      <w:r>
+        <w:t xml:space="preserve">de l'article</w:t>
+      </w:r>
+      <w:r>
+        <w:t xml:space="preserve"> </w:t>
+      </w:r>
+      <w:r>
+        <w:t xml:space="preserve">BMJ Open), fidèlement rendus en français. Sources en fin de document.</w:t>
       </w:r>
     </w:p>
     <w:bookmarkStart w:id="10" w:name="référence-primaire"/>
@@ -220,48 +198,209 @@
         </w:r>
       </w:hyperlink>
     </w:p>
-    <w:p>
-      <w:pPr>
-        <w:pStyle w:val="Compact"/>
-        <w:numPr>
-          <w:ilvl w:val="0"/>
-          <w:numId w:val="1001"/>
-        </w:numPr>
-      </w:pPr>
-      <w:r>
-        <w:t xml:space="preserve">« Support document » officiel (aide à l'usage, par item) : annexe de l'article BMJ Open</w:t>
-      </w:r>
-      <w:r>
-        <w:t xml:space="preserve"> </w:t>
-      </w:r>
-      <w:r>
-        <w:t xml:space="preserve">(rubrique</w:t>
-      </w:r>
-      <w:r>
-        <w:t xml:space="preserve"> </w:t>
+    <w:bookmarkEnd w:id="10"/>
+    <w:bookmarkStart w:id="11" w:name="préambule-texte-officiel-de-loutil"/>
+    <w:p>
+      <w:pPr>
+        <w:pStyle w:val="Heading2"/>
+      </w:pPr>
+      <w:r>
+        <w:t xml:space="preserve">Préambule (texte officiel de l'outil)</w:t>
+      </w:r>
+    </w:p>
+    <w:p>
+      <w:pPr>
+        <w:pStyle w:val="FirstParagraph"/>
+      </w:pPr>
+      <w:r>
+        <w:t xml:space="preserve">L'évaluation critique (</w:t>
       </w:r>
       <w:r>
         <w:rPr>
           <w:i/>
           <w:iCs/>
         </w:rPr>
-        <w:t xml:space="preserve">Data supplement</w:t>
-      </w:r>
-      <w:r>
-        <w:t xml:space="preserve"> </w:t>
-      </w:r>
-      <w:r>
-        <w:t xml:space="preserve">— nécessite un navigateur ; BMJ bloque les robots).</w:t>
-      </w:r>
-    </w:p>
-    <w:bookmarkEnd w:id="10"/>
-    <w:bookmarkStart w:id="11" w:name="principes-verbatim-du-papier"/>
+        <w:t xml:space="preserve">critical appraisal</w:t>
+      </w:r>
+      <w:r>
+        <w:t xml:space="preserve">, CA) sert à apprécier systématiquement un</w:t>
+      </w:r>
+      <w:r>
+        <w:t xml:space="preserve"> </w:t>
+      </w:r>
+      <w:r>
+        <w:t xml:space="preserve">article de recherche et à juger la</w:t>
+      </w:r>
+      <w:r>
+        <w:t xml:space="preserve"> </w:t>
+      </w:r>
+      <w:r>
+        <w:rPr>
+          <w:b/>
+          <w:bCs/>
+        </w:rPr>
+        <w:t xml:space="preserve">fiabilité</w:t>
+      </w:r>
+      <w:r>
+        <w:t xml:space="preserve"> </w:t>
+      </w:r>
+      <w:r>
+        <w:t xml:space="preserve">de l'étude présentée, ainsi que sa valeur</w:t>
+      </w:r>
+      <w:r>
+        <w:t xml:space="preserve"> </w:t>
+      </w:r>
+      <w:r>
+        <w:t xml:space="preserve">et sa pertinence. Ses domaines clés incluent l'</w:t>
+      </w:r>
+      <w:r>
+        <w:rPr>
+          <w:b/>
+          <w:bCs/>
+        </w:rPr>
+        <w:t xml:space="preserve">adéquation</w:t>
+      </w:r>
+      <w:r>
+        <w:t xml:space="preserve"> </w:t>
+      </w:r>
+      <w:r>
+        <w:t xml:space="preserve">de l'étude à répondre à la</w:t>
+      </w:r>
+      <w:r>
+        <w:t xml:space="preserve"> </w:t>
+      </w:r>
+      <w:r>
+        <w:t xml:space="preserve">question posée et la</w:t>
+      </w:r>
+      <w:r>
+        <w:t xml:space="preserve"> </w:t>
+      </w:r>
+      <w:r>
+        <w:rPr>
+          <w:b/>
+          <w:bCs/>
+        </w:rPr>
+        <w:t xml:space="preserve">possibilité d'introduction de biais</w:t>
+      </w:r>
+      <w:r>
+        <w:t xml:space="preserve">. Identifier ces domaines exige</w:t>
+      </w:r>
+      <w:r>
+        <w:t xml:space="preserve"> </w:t>
+      </w:r>
+      <w:r>
+        <w:t xml:space="preserve">un</w:t>
+      </w:r>
+      <w:r>
+        <w:t xml:space="preserve"> </w:t>
+      </w:r>
+      <w:r>
+        <w:rPr>
+          <w:b/>
+          <w:bCs/>
+        </w:rPr>
+        <w:t xml:space="preserve">bon report</w:t>
+      </w:r>
+      <w:r>
+        <w:t xml:space="preserve"> </w:t>
+      </w:r>
+      <w:r>
+        <w:t xml:space="preserve">: si l'étude est mal rapportée, l'appréciation de l'adéquation et du biais</w:t>
+      </w:r>
+      <w:r>
+        <w:t xml:space="preserve"> </w:t>
+      </w:r>
+      <w:r>
+        <w:t xml:space="preserve">devient difficile.</w:t>
+      </w:r>
+    </w:p>
+    <w:p>
+      <w:pPr>
+        <w:pStyle w:val="BodyText"/>
+      </w:pPr>
+      <w:r>
+        <w:t xml:space="preserve">AXIS a été développé pour apprécier les</w:t>
+      </w:r>
+      <w:r>
+        <w:t xml:space="preserve"> </w:t>
+      </w:r>
+      <w:r>
+        <w:rPr>
+          <w:b/>
+          <w:bCs/>
+        </w:rPr>
+        <w:t xml:space="preserve">études transversales observationnelles</w:t>
+      </w:r>
+      <w:r>
+        <w:t xml:space="preserve">. Les</w:t>
+      </w:r>
+      <w:r>
+        <w:t xml:space="preserve"> </w:t>
+      </w:r>
+      <w:r>
+        <w:t xml:space="preserve">questions sont présentées dans l'ordre où elles apparaissent généralement dans un article.</w:t>
+      </w:r>
+      <w:r>
+        <w:t xml:space="preserve"> </w:t>
+      </w:r>
+      <w:r>
+        <w:t xml:space="preserve">But : aider l'</w:t>
+      </w:r>
+      <w:r>
+        <w:rPr>
+          <w:b/>
+          <w:bCs/>
+        </w:rPr>
+        <w:t xml:space="preserve">interprétation systématique</w:t>
+      </w:r>
+      <w:r>
+        <w:t xml:space="preserve"> </w:t>
+      </w:r>
+      <w:r>
+        <w:t xml:space="preserve">d'une étude transversale et éclairer les</w:t>
+      </w:r>
+      <w:r>
+        <w:t xml:space="preserve"> </w:t>
+      </w:r>
+      <w:r>
+        <w:t xml:space="preserve">décisions sur sa qualité. Chaque question se répond par</w:t>
+      </w:r>
+      <w:r>
+        <w:t xml:space="preserve"> </w:t>
+      </w:r>
+      <w:r>
+        <w:rPr>
+          <w:b/>
+          <w:bCs/>
+        </w:rPr>
+        <w:t xml:space="preserve">« oui » / « non » / « ne sait</w:t>
+      </w:r>
+      <w:r>
+        <w:rPr>
+          <w:b/>
+          <w:bCs/>
+        </w:rPr>
+        <w:t xml:space="preserve"> </w:t>
+      </w:r>
+      <w:r>
+        <w:rPr>
+          <w:b/>
+          <w:bCs/>
+        </w:rPr>
+        <w:t xml:space="preserve">pas »</w:t>
+      </w:r>
+      <w:r>
+        <w:t xml:space="preserve">, avec place pour de courts commentaires.</w:t>
+      </w:r>
+    </w:p>
+    <w:bookmarkEnd w:id="11"/>
+    <w:bookmarkStart w:id="12" w:name="principes-de-scoring"/>
     <w:p>
       <w:pPr>
         <w:pStyle w:val="Heading2"/>
       </w:pPr>
       <w:r>
-        <w:t xml:space="preserve">Principes (verbatim du papier)</w:t>
+        <w:t xml:space="preserve">Principes de scoring</w:t>
       </w:r>
     </w:p>
     <w:p>
@@ -277,51 +416,23 @@
           <w:b/>
           <w:bCs/>
         </w:rPr>
-        <w:t xml:space="preserve">Portée</w:t>
-      </w:r>
-      <w:r>
-        <w:t xml:space="preserve"> </w:t>
-      </w:r>
-      <w:r>
-        <w:t xml:space="preserve">: uniquement les</w:t>
-      </w:r>
-      <w:r>
-        <w:t xml:space="preserve"> </w:t>
-      </w:r>
-      <w:r>
-        <w:rPr>
-          <w:b/>
-          <w:bCs/>
-        </w:rPr>
-        <w:t xml:space="preserve">études transversales</w:t>
-      </w:r>
-      <w:r>
-        <w:t xml:space="preserve"> </w:t>
-      </w:r>
-      <w:r>
-        <w:t xml:space="preserve">(cross-sectional / enquêtes de</w:t>
-      </w:r>
-      <w:r>
-        <w:t xml:space="preserve"> </w:t>
-      </w:r>
-      <w:r>
-        <w:t xml:space="preserve">prévalence à un instant T). Développé par</w:t>
-      </w:r>
-      <w:r>
-        <w:t xml:space="preserve"> </w:t>
-      </w:r>
-      <w:r>
-        <w:rPr>
-          <w:b/>
-          <w:bCs/>
-        </w:rPr>
-        <w:t xml:space="preserve">méthode Delphi</w:t>
-      </w:r>
-      <w:r>
-        <w:t xml:space="preserve"> </w:t>
-      </w:r>
-      <w:r>
-        <w:t xml:space="preserve">(3 tours, consensus d'experts).</w:t>
+        <w:t xml:space="preserve">20 items</w:t>
+      </w:r>
+      <w:r>
+        <w:t xml:space="preserve">. Réponses</w:t>
+      </w:r>
+      <w:r>
+        <w:t xml:space="preserve"> </w:t>
+      </w:r>
+      <w:r>
+        <w:rPr>
+          <w:b/>
+          <w:bCs/>
+        </w:rPr>
+        <w:t xml:space="preserve">Oui / Non / Ne sait pas</w:t>
+      </w:r>
+      <w:r>
+        <w:t xml:space="preserve">.</w:t>
       </w:r>
     </w:p>
     <w:p>
@@ -337,26 +448,40 @@
           <w:b/>
           <w:bCs/>
         </w:rPr>
-        <w:t xml:space="preserve">20 items</w:t>
-      </w:r>
-      <w:r>
-        <w:t xml:space="preserve">, réponses</w:t>
-      </w:r>
-      <w:r>
-        <w:t xml:space="preserve"> </w:t>
-      </w:r>
-      <w:r>
-        <w:rPr>
-          <w:b/>
-          <w:bCs/>
-        </w:rPr>
-        <w:t xml:space="preserve">Oui / Non / Ne sait pas</w:t>
-      </w:r>
-      <w:r>
-        <w:t xml:space="preserve"> </w:t>
-      </w:r>
-      <w:r>
-        <w:t xml:space="preserve">(« Yes / No / Don't know »).</w:t>
+        <w:t xml:space="preserve">PAS de score chiffré</w:t>
+      </w:r>
+      <w:r>
+        <w:t xml:space="preserve"> </w:t>
+      </w:r>
+      <w:r>
+        <w:t xml:space="preserve">: choix délibéré des auteurs. La qualité exige un</w:t>
+      </w:r>
+      <w:r>
+        <w:t xml:space="preserve"> </w:t>
+      </w:r>
+      <w:r>
+        <w:rPr>
+          <w:b/>
+          <w:bCs/>
+        </w:rPr>
+        <w:t xml:space="preserve">jugement</w:t>
+      </w:r>
+      <w:r>
+        <w:rPr>
+          <w:b/>
+          <w:bCs/>
+        </w:rPr>
+        <w:t xml:space="preserve"> </w:t>
+      </w:r>
+      <w:r>
+        <w:rPr>
+          <w:b/>
+          <w:bCs/>
+        </w:rPr>
+        <w:t xml:space="preserve">subjectif par aspect</w:t>
+      </w:r>
+      <w:r>
+        <w:t xml:space="preserve">, pas une agrégation en une note unique.</w:t>
       </w:r>
     </w:p>
     <w:p>
@@ -368,36 +493,23 @@
         </w:numPr>
       </w:pPr>
       <w:r>
-        <w:rPr>
-          <w:b/>
-          <w:bCs/>
-        </w:rPr>
-        <w:t xml:space="preserve">PAS de score chiffré</w:t>
-      </w:r>
-      <w:r>
-        <w:t xml:space="preserve"> </w:t>
-      </w:r>
-      <w:r>
-        <w:t xml:space="preserve">: c'est un choix délibéré des auteurs. L'évaluation de la</w:t>
-      </w:r>
-      <w:r>
-        <w:t xml:space="preserve"> </w:t>
-      </w:r>
-      <w:r>
-        <w:t xml:space="preserve">qualité exige un</w:t>
-      </w:r>
-      <w:r>
-        <w:t xml:space="preserve"> </w:t>
-      </w:r>
-      <w:r>
-        <w:rPr>
-          <w:b/>
-          <w:bCs/>
-        </w:rPr>
-        <w:t xml:space="preserve">jugement subjectif par aspect</w:t>
-      </w:r>
-      <w:r>
-        <w:t xml:space="preserve">, pas une agrégation en une note unique.</w:t>
+        <w:t xml:space="preserve">Développé par</w:t>
+      </w:r>
+      <w:r>
+        <w:t xml:space="preserve"> </w:t>
+      </w:r>
+      <w:r>
+        <w:rPr>
+          <w:b/>
+          <w:bCs/>
+        </w:rPr>
+        <w:t xml:space="preserve">méthode Delphi</w:t>
+      </w:r>
+      <w:r>
+        <w:t xml:space="preserve"> </w:t>
+      </w:r>
+      <w:r>
+        <w:t xml:space="preserve">(plusieurs tours, consensus d'experts).</w:t>
       </w:r>
     </w:p>
     <w:p>
@@ -425,23 +537,37 @@
         <w:t xml:space="preserve"> </w:t>
       </w:r>
       <w:r>
-        <w:t xml:space="preserve">(1,4,10,11,12,16,18) ·</w:t>
-      </w:r>
-      <w:r>
-        <w:t xml:space="preserve"> </w:t>
-      </w:r>
-      <w:r>
-        <w:rPr>
-          <w:b/>
-          <w:bCs/>
-        </w:rPr>
-        <w:t xml:space="preserve">Qualité du design</w:t>
-      </w:r>
-      <w:r>
-        <w:t xml:space="preserve"> </w:t>
-      </w:r>
-      <w:r>
-        <w:t xml:space="preserve">(2,3,5,8,17,19,20) ·</w:t>
+        <w:t xml:space="preserve">(items 1, 4, 10, 11, 12, 16, 18) ·</w:t>
+      </w:r>
+      <w:r>
+        <w:t xml:space="preserve"> </w:t>
+      </w:r>
+      <w:r>
+        <w:rPr>
+          <w:b/>
+          <w:bCs/>
+        </w:rPr>
+        <w:t xml:space="preserve">Qualité du</w:t>
+      </w:r>
+      <w:r>
+        <w:rPr>
+          <w:b/>
+          <w:bCs/>
+        </w:rPr>
+        <w:t xml:space="preserve"> </w:t>
+      </w:r>
+      <w:r>
+        <w:rPr>
+          <w:b/>
+          <w:bCs/>
+        </w:rPr>
+        <w:t xml:space="preserve">design</w:t>
+      </w:r>
+      <w:r>
+        <w:t xml:space="preserve"> </w:t>
+      </w:r>
+      <w:r>
+        <w:t xml:space="preserve">(2, 3, 5, 8, 17, 19, 20) ·</w:t>
       </w:r>
       <w:r>
         <w:t xml:space="preserve"> </w:t>
@@ -457,7 +583,7 @@
         <w:t xml:space="preserve"> </w:t>
       </w:r>
       <w:r>
-        <w:t xml:space="preserve">(6,7,9,13,14,15).</w:t>
+        <w:t xml:space="preserve">(6, 7, 9, 13, 14, 15).</w:t>
       </w:r>
     </w:p>
     <w:p>
@@ -495,7 +621,13 @@
         <w:t xml:space="preserve"> </w:t>
       </w:r>
       <w:r>
-        <w:t xml:space="preserve">et</w:t>
+        <w:t xml:space="preserve">(le taux de</w:t>
+      </w:r>
+      <w:r>
+        <w:t xml:space="preserve"> </w:t>
+      </w:r>
+      <w:r>
+        <w:t xml:space="preserve">réponse soulève-t-il des inquiétudes ?) et</w:t>
       </w:r>
       <w:r>
         <w:t xml:space="preserve"> </w:t>
@@ -508,17 +640,70 @@
         <w:t xml:space="preserve">item 19</w:t>
       </w:r>
       <w:r>
-        <w:t xml:space="preserve">.</w:t>
-      </w:r>
-    </w:p>
-    <w:bookmarkEnd w:id="11"/>
-    <w:bookmarkStart w:id="12" w:name="les-20-items"/>
+        <w:t xml:space="preserve"> </w:t>
+      </w:r>
+      <w:r>
+        <w:t xml:space="preserve">(existe-t-il des conflits d'intérêts ?).</w:t>
+      </w:r>
+    </w:p>
+    <w:p>
+      <w:pPr>
+        <w:pStyle w:val="Compact"/>
+        <w:numPr>
+          <w:ilvl w:val="0"/>
+          <w:numId w:val="1002"/>
+        </w:numPr>
+      </w:pPr>
+      <w:r>
+        <w:rPr>
+          <w:b/>
+          <w:bCs/>
+        </w:rPr>
+        <w:t xml:space="preserve">Cas du recensement (census)</w:t>
+      </w:r>
+      <w:r>
+        <w:t xml:space="preserve"> </w:t>
+      </w:r>
+      <w:r>
+        <w:t xml:space="preserve">: si population cible = participants (recensement), les</w:t>
+      </w:r>
+      <w:r>
+        <w:t xml:space="preserve"> </w:t>
+      </w:r>
+      <w:r>
+        <w:t xml:space="preserve">items</w:t>
+      </w:r>
+      <w:r>
+        <w:t xml:space="preserve"> </w:t>
+      </w:r>
+      <w:r>
+        <w:rPr>
+          <w:b/>
+          <w:bCs/>
+        </w:rPr>
+        <w:t xml:space="preserve">5, 6 et 7</w:t>
+      </w:r>
+      <w:r>
+        <w:t xml:space="preserve"> </w:t>
+      </w:r>
+      <w:r>
+        <w:t xml:space="preserve">ne s'appliquent en théorie pas — mais il faut alors clairement indiquer</w:t>
+      </w:r>
+      <w:r>
+        <w:t xml:space="preserve"> </w:t>
+      </w:r>
+      <w:r>
+        <w:t xml:space="preserve">d'où viennent les participants.</w:t>
+      </w:r>
+    </w:p>
+    <w:bookmarkEnd w:id="12"/>
+    <w:bookmarkStart w:id="13" w:name="Xe48cb57e61589aaf680586fef989fc2e9497ac0"/>
     <w:p>
       <w:pPr>
         <w:pStyle w:val="Heading2"/>
       </w:pPr>
       <w:r>
-        <w:t xml:space="preserve">Les 20 items</w:t>
+        <w:t xml:space="preserve">Les 20 items — question officielle + texte d'aide</w:t>
       </w:r>
     </w:p>
     <w:p>
@@ -536,7 +721,7 @@
           <w:b/>
           <w:bCs/>
         </w:rPr>
-        <w:t xml:space="preserve">N. Question officielle (FR)</w:t>
+        <w:t xml:space="preserve">N. Question (FR)</w:t>
       </w:r>
       <w:r>
         <w:t xml:space="preserve"> </w:t>
@@ -574,13 +759,13 @@
           <w:b/>
           <w:bCs/>
         </w:rPr>
-        <w:t xml:space="preserve">Interprétation</w:t>
-      </w:r>
-      <w:r>
-        <w:t xml:space="preserve"> </w:t>
-      </w:r>
-      <w:r>
-        <w:t xml:space="preserve">(aide à l'évaluation).</w:t>
+        <w:t xml:space="preserve">Aide officielle</w:t>
+      </w:r>
+      <w:r>
+        <w:t xml:space="preserve"> </w:t>
+      </w:r>
+      <w:r>
+        <w:t xml:space="preserve">(pourquoi la question, comment y répondre).</w:t>
       </w:r>
     </w:p>
     <w:p>
@@ -592,7 +777,7 @@
           <w:b/>
           <w:bCs/>
         </w:rPr>
-        <w:t xml:space="preserve">1. Les objectifs de l'étude étaient-ils clairs ?</w:t>
+        <w:t xml:space="preserve">1. Les objectifs/buts de l'étude étaient-ils clairs ?</w:t>
       </w:r>
       <w:r>
         <w:t xml:space="preserve"> </w:t>
@@ -620,7 +805,49 @@
         <w:t xml:space="preserve"> </w:t>
       </w:r>
       <w:r>
-        <w:t xml:space="preserve">→ Chercher un objectif/une question de recherche explicitement énoncé(e), généralement en fin d'introduction.</w:t>
+        <w:t xml:space="preserve">→ L'objectif indique si l'étude traite une question</w:t>
+      </w:r>
+      <w:r>
+        <w:t xml:space="preserve"> </w:t>
+      </w:r>
+      <w:r>
+        <w:rPr>
+          <w:b/>
+          <w:bCs/>
+        </w:rPr>
+        <w:t xml:space="preserve">appropriée et clairement ciblée</w:t>
+      </w:r>
+      <w:r>
+        <w:t xml:space="preserve">. S'il n'est pas clairement énoncé (ou pas du tout), il est difficile voire impossible d'évaluer si les objectifs ont été atteints. Idéalement énoncé au</w:t>
+      </w:r>
+      <w:r>
+        <w:t xml:space="preserve"> </w:t>
+      </w:r>
+      <w:r>
+        <w:rPr>
+          <w:b/>
+          <w:bCs/>
+        </w:rPr>
+        <w:t xml:space="preserve">début du résumé</w:t>
+      </w:r>
+      <w:r>
+        <w:t xml:space="preserve"> </w:t>
+      </w:r>
+      <w:r>
+        <w:t xml:space="preserve">ET à la</w:t>
+      </w:r>
+      <w:r>
+        <w:t xml:space="preserve"> </w:t>
+      </w:r>
+      <w:r>
+        <w:rPr>
+          <w:b/>
+          <w:bCs/>
+        </w:rPr>
+        <w:t xml:space="preserve">fin de l'introduction</w:t>
+      </w:r>
+      <w:r>
+        <w:t xml:space="preserve">. Si la réponse est « non », plusieurs autres items deviennent difficiles à évaluer.</w:t>
       </w:r>
     </w:p>
     <w:p>
@@ -660,7 +887,52 @@
         <w:t xml:space="preserve"> </w:t>
       </w:r>
       <w:r>
-        <w:t xml:space="preserve">→ Un devis transversal convient pour estimer une prévalence/une association à un instant T, PAS pour établir une causalité ou une temporalité.</w:t>
+        <w:t xml:space="preserve">→ Évalue l'</w:t>
+      </w:r>
+      <w:r>
+        <w:rPr>
+          <w:b/>
+          <w:bCs/>
+        </w:rPr>
+        <w:t xml:space="preserve">adéquation d'un devis transversal</w:t>
+      </w:r>
+      <w:r>
+        <w:t xml:space="preserve"> </w:t>
+      </w:r>
+      <w:r>
+        <w:t xml:space="preserve">pour atteindre les objectifs. Les études transversales sont observationnelles, décrivent une population à un</w:t>
+      </w:r>
+      <w:r>
+        <w:t xml:space="preserve"> </w:t>
+      </w:r>
+      <w:r>
+        <w:rPr>
+          <w:b/>
+          <w:bCs/>
+        </w:rPr>
+        <w:t xml:space="preserve">instant donné</w:t>
+      </w:r>
+      <w:r>
+        <w:t xml:space="preserve"> </w:t>
+      </w:r>
+      <w:r>
+        <w:t xml:space="preserve">; utiles pour la</w:t>
+      </w:r>
+      <w:r>
+        <w:t xml:space="preserve"> </w:t>
+      </w:r>
+      <w:r>
+        <w:rPr>
+          <w:b/>
+          <w:bCs/>
+        </w:rPr>
+        <w:t xml:space="preserve">prévalence</w:t>
+      </w:r>
+      <w:r>
+        <w:t xml:space="preserve"> </w:t>
+      </w:r>
+      <w:r>
+        <w:t xml:space="preserve">et pour tester associations/différences entre groupes. Exemples : enquêtes ponctuelles, analyse de dossiers, audits de pratique. Le lecteur juge si le transversal convient aux questions posées.</w:t>
       </w:r>
     </w:p>
     <w:p>
@@ -700,23 +972,107 @@
         <w:t xml:space="preserve"> </w:t>
       </w:r>
       <w:r>
-        <w:t xml:space="preserve">→ Chercher un</w:t>
-      </w:r>
-      <w:r>
-        <w:t xml:space="preserve"> </w:t>
-      </w:r>
-      <w:r>
-        <w:rPr>
-          <w:b/>
-          <w:bCs/>
-        </w:rPr>
-        <w:t xml:space="preserve">calcul de puissance a priori</w:t>
-      </w:r>
-      <w:r>
-        <w:t xml:space="preserve"> </w:t>
-      </w:r>
-      <w:r>
-        <w:t xml:space="preserve">ou une justification de la taille. Un grand N n'est pas une justification en soi.</w:t>
+        <w:t xml:space="preserve">→ Crucial : la taille affecte profondément la significativité. Trop petit → conclusions</w:t>
+      </w:r>
+      <w:r>
+        <w:t xml:space="preserve"> </w:t>
+      </w:r>
+      <w:r>
+        <w:rPr>
+          <w:b/>
+          <w:bCs/>
+        </w:rPr>
+        <w:t xml:space="preserve">sous-puissées</w:t>
+      </w:r>
+      <w:r>
+        <w:t xml:space="preserve">, risque d'</w:t>
+      </w:r>
+      <w:r>
+        <w:rPr>
+          <w:b/>
+          <w:bCs/>
+        </w:rPr>
+        <w:t xml:space="preserve">erreur de type II</w:t>
+      </w:r>
+      <w:r>
+        <w:t xml:space="preserve"> </w:t>
+      </w:r>
+      <w:r>
+        <w:t xml:space="preserve">(« faux négatif »). L'</w:t>
+      </w:r>
+      <w:r>
+        <w:rPr>
+          <w:b/>
+          <w:bCs/>
+        </w:rPr>
+        <w:t xml:space="preserve">erreur de type I</w:t>
+      </w:r>
+      <w:r>
+        <w:t xml:space="preserve"> </w:t>
+      </w:r>
+      <w:r>
+        <w:t xml:space="preserve">(« faux positif », liée à la p-value) est aussi prise en compte. La question demande si la justification est</w:t>
+      </w:r>
+      <w:r>
+        <w:t xml:space="preserve"> </w:t>
+      </w:r>
+      <w:r>
+        <w:rPr>
+          <w:b/>
+          <w:bCs/>
+        </w:rPr>
+        <w:t xml:space="preserve">rapportée</w:t>
+      </w:r>
+      <w:r>
+        <w:t xml:space="preserve"> </w:t>
+      </w:r>
+      <w:r>
+        <w:t xml:space="preserve">ET si la</w:t>
+      </w:r>
+      <w:r>
+        <w:t xml:space="preserve"> </w:t>
+      </w:r>
+      <w:r>
+        <w:rPr>
+          <w:b/>
+          <w:bCs/>
+        </w:rPr>
+        <w:t xml:space="preserve">méthode de calcul</w:t>
+      </w:r>
+      <w:r>
+        <w:t xml:space="preserve"> </w:t>
+      </w:r>
+      <w:r>
+        <w:t xml:space="preserve">est claire. Le</w:t>
+      </w:r>
+      <w:r>
+        <w:t xml:space="preserve"> </w:t>
+      </w:r>
+      <w:r>
+        <w:rPr>
+          <w:b/>
+          <w:bCs/>
+        </w:rPr>
+        <w:t xml:space="preserve">clustering</w:t>
+      </w:r>
+      <w:r>
+        <w:t xml:space="preserve"> </w:t>
+      </w:r>
+      <w:r>
+        <w:t xml:space="preserve">(ex. patients dans des hôpitaux) doit être pris en compte. Si la justification manque, ou si des contraintes ont empêché d'atteindre la taille désirée, cela devrait être</w:t>
+      </w:r>
+      <w:r>
+        <w:t xml:space="preserve"> </w:t>
+      </w:r>
+      <w:r>
+        <w:rPr>
+          <w:b/>
+          <w:bCs/>
+        </w:rPr>
+        <w:t xml:space="preserve">déclaré</w:t>
+      </w:r>
+      <w:r>
+        <w:t xml:space="preserve">.</w:t>
       </w:r>
     </w:p>
     <w:p>
@@ -756,7 +1112,39 @@
         <w:t xml:space="preserve"> </w:t>
       </w:r>
       <w:r>
-        <w:t xml:space="preserve">→ Est-il clair « de qui » parle la recherche (critères, cadre) ?</w:t>
+        <w:t xml:space="preserve">→ La population cible = la</w:t>
+      </w:r>
+      <w:r>
+        <w:t xml:space="preserve"> </w:t>
+      </w:r>
+      <w:r>
+        <w:rPr>
+          <w:b/>
+          <w:bCs/>
+        </w:rPr>
+        <w:t xml:space="preserve">population globale visée</w:t>
+      </w:r>
+      <w:r>
+        <w:t xml:space="preserve"> </w:t>
+      </w:r>
+      <w:r>
+        <w:t xml:space="preserve">(celle sur laquelle on veut conclure, ou la population à risque). Ex. « toute la population féminine du R.-U. ». La question demande si elle est</w:t>
+      </w:r>
+      <w:r>
+        <w:t xml:space="preserve"> </w:t>
+      </w:r>
+      <w:r>
+        <w:rPr>
+          <w:b/>
+          <w:bCs/>
+        </w:rPr>
+        <w:t xml:space="preserve">clairement définie</w:t>
+      </w:r>
+      <w:r>
+        <w:t xml:space="preserve"> </w:t>
+      </w:r>
+      <w:r>
+        <w:t xml:space="preserve">; sinon, les inférences du chercheur peuvent être inappropriées.</w:t>
       </w:r>
     </w:p>
     <w:p>
@@ -796,47 +1184,59 @@
         <w:t xml:space="preserve"> </w:t>
       </w:r>
       <w:r>
-        <w:t xml:space="preserve">→ La liste/source d'où l'échantillon est tiré reflète-t-elle bien la population visée (risque de biais de couverture) ?</w:t>
-      </w:r>
-    </w:p>
-    <w:p>
-      <w:pPr>
-        <w:pStyle w:val="BodyText"/>
-      </w:pPr>
-      <w:r>
-        <w:rPr>
-          <w:b/>
-          <w:bCs/>
-        </w:rPr>
-        <w:t xml:space="preserve">6. Le processus de sélection produisait-il des participants représentatifs ?</w:t>
-      </w:r>
-      <w:r>
-        <w:t xml:space="preserve"> </w:t>
-      </w:r>
-      <w:r>
-        <w:t xml:space="preserve">—</w:t>
-      </w:r>
-      <w:r>
-        <w:t xml:space="preserve"> </w:t>
+        <w:t xml:space="preserve">→ La</w:t>
+      </w:r>
+      <w:r>
+        <w:t xml:space="preserve"> </w:t>
+      </w:r>
+      <w:r>
+        <w:rPr>
+          <w:b/>
+          <w:bCs/>
+        </w:rPr>
+        <w:t xml:space="preserve">base de sondage</w:t>
+      </w:r>
+      <w:r>
+        <w:t xml:space="preserve"> </w:t>
+      </w:r>
+      <w:r>
+        <w:t xml:space="preserve">(</w:t>
       </w:r>
       <w:r>
         <w:rPr>
           <w:i/>
           <w:iCs/>
         </w:rPr>
-        <w:t xml:space="preserve">Was the selection process likely to select subjects/participants that were representative of the target/reference population under investigation?</w:t>
-      </w:r>
-      <w:r>
-        <w:t xml:space="preserve"> </w:t>
-      </w:r>
-      <w:r>
-        <w:t xml:space="preserve">— [Biais]</w:t>
-      </w:r>
-      <w:r>
-        <w:t xml:space="preserve"> </w:t>
-      </w:r>
-      <w:r>
-        <w:t xml:space="preserve">→ Méthode d'échantillonnage (aléatoire ? critères ?), risque de biais de sélection.</w:t>
+        <w:t xml:space="preserve">sampling frame</w:t>
+      </w:r>
+      <w:r>
+        <w:t xml:space="preserve">) = liste/source de la population d'étude utilisée pour recruter. Idéalement de même composition que la population cible ; en pratique plus petite, mais</w:t>
+      </w:r>
+      <w:r>
+        <w:t xml:space="preserve"> </w:t>
+      </w:r>
+      <w:r>
+        <w:rPr>
+          <w:b/>
+          <w:bCs/>
+        </w:rPr>
+        <w:t xml:space="preserve">doit rester représentative</w:t>
+      </w:r>
+      <w:r>
+        <w:t xml:space="preserve">, car les résultats serviront à conclure sur la population cible. ⚠️ L'</w:t>
+      </w:r>
+      <w:r>
+        <w:rPr>
+          <w:b/>
+          <w:bCs/>
+        </w:rPr>
+        <w:t xml:space="preserve">échantillonnage de convenance</w:t>
+      </w:r>
+      <w:r>
+        <w:t xml:space="preserve"> </w:t>
+      </w:r>
+      <w:r>
+        <w:t xml:space="preserve">produit des échantillons non représentatifs/biaisés (acceptable pour un pilote, mais à déclarer).</w:t>
       </w:r>
     </w:p>
     <w:p>
@@ -848,7 +1248,7 @@
           <w:b/>
           <w:bCs/>
         </w:rPr>
-        <w:t xml:space="preserve">7. Des mesures ont-elles été prises pour traiter/catégoriser les non-répondants ?</w:t>
+        <w:t xml:space="preserve">6. Le processus de sélection produisait-il des participants représentatifs ?</w:t>
       </w:r>
       <w:r>
         <w:t xml:space="preserve"> </w:t>
@@ -864,7 +1264,7 @@
           <w:i/>
           <w:iCs/>
         </w:rPr>
-        <w:t xml:space="preserve">Were measures undertaken to address and categorise non-responders?</w:t>
+        <w:t xml:space="preserve">Was the selection process likely to select subjects/participants that were representative of the target/reference population under investigation?</w:t>
       </w:r>
       <w:r>
         <w:t xml:space="preserve"> </w:t>
@@ -876,25 +1276,87 @@
         <w:t xml:space="preserve"> </w:t>
       </w:r>
       <w:r>
-        <w:t xml:space="preserve">→ Les non-répondants sont-ils identifiés, comptés, comparés aux répondants ?</w:t>
-      </w:r>
-    </w:p>
-    <w:p>
-      <w:pPr>
-        <w:pStyle w:val="BodyText"/>
-      </w:pPr>
-      <w:r>
-        <w:rPr>
-          <w:b/>
-          <w:bCs/>
-        </w:rPr>
-        <w:t xml:space="preserve">8. Les variables d'exposition et de résultat mesurées étaient-elles adaptées aux objectifs ?</w:t>
-      </w:r>
-      <w:r>
-        <w:t xml:space="preserve"> </w:t>
-      </w:r>
-      <w:r>
-        <w:t xml:space="preserve">—</w:t>
+        <w:t xml:space="preserve">→ Établit</w:t>
+      </w:r>
+      <w:r>
+        <w:t xml:space="preserve"> </w:t>
+      </w:r>
+      <w:r>
+        <w:rPr>
+          <w:b/>
+          <w:bCs/>
+        </w:rPr>
+        <w:t xml:space="preserve">comment</w:t>
+      </w:r>
+      <w:r>
+        <w:t xml:space="preserve"> </w:t>
+      </w:r>
+      <w:r>
+        <w:t xml:space="preserve">on est passé de la base de sondage aux participants — cœur du</w:t>
+      </w:r>
+      <w:r>
+        <w:t xml:space="preserve"> </w:t>
+      </w:r>
+      <w:r>
+        <w:rPr>
+          <w:b/>
+          <w:bCs/>
+        </w:rPr>
+        <w:t xml:space="preserve">biais de sélection</w:t>
+      </w:r>
+      <w:r>
+        <w:t xml:space="preserve"> </w:t>
+      </w:r>
+      <w:r>
+        <w:t xml:space="preserve">et de la généralisabilité. Regarder les</w:t>
+      </w:r>
+      <w:r>
+        <w:t xml:space="preserve"> </w:t>
+      </w:r>
+      <w:r>
+        <w:rPr>
+          <w:b/>
+          <w:bCs/>
+        </w:rPr>
+        <w:t xml:space="preserve">critères d'inclusion/exclusion</w:t>
+      </w:r>
+      <w:r>
+        <w:t xml:space="preserve"> </w:t>
+      </w:r>
+      <w:r>
+        <w:t xml:space="preserve">(des critères inappropriés déforment la représentativité). Le biais survient si toute unité n'a pas une</w:t>
+      </w:r>
+      <w:r>
+        <w:t xml:space="preserve"> </w:t>
+      </w:r>
+      <w:r>
+        <w:rPr>
+          <w:b/>
+          <w:bCs/>
+        </w:rPr>
+        <w:t xml:space="preserve">chance égale</w:t>
+      </w:r>
+      <w:r>
+        <w:t xml:space="preserve"> </w:t>
+      </w:r>
+      <w:r>
+        <w:t xml:space="preserve">d'être incluse ; la</w:t>
+      </w:r>
+      <w:r>
+        <w:t xml:space="preserve"> </w:t>
+      </w:r>
+      <w:r>
+        <w:rPr>
+          <w:b/>
+          <w:bCs/>
+        </w:rPr>
+        <w:t xml:space="preserve">randomisation</w:t>
+      </w:r>
+      <w:r>
+        <w:t xml:space="preserve"> </w:t>
+      </w:r>
+      <w:r>
+        <w:t xml:space="preserve">garantit cette chance égale. Attention aux effets connus :</w:t>
       </w:r>
       <w:r>
         <w:t xml:space="preserve"> </w:t>
@@ -904,19 +1366,26 @@
           <w:i/>
           <w:iCs/>
         </w:rPr>
-        <w:t xml:space="preserve">Were the risk factor and outcome variables measured appropriate to the aims of the study?</w:t>
-      </w:r>
-      <w:r>
-        <w:t xml:space="preserve"> </w:t>
-      </w:r>
-      <w:r>
-        <w:t xml:space="preserve">— [Design]</w:t>
-      </w:r>
-      <w:r>
-        <w:t xml:space="preserve"> </w:t>
-      </w:r>
-      <w:r>
-        <w:t xml:space="preserve">→ Les variables mesurées produisent-elles des données pertinentes pour la question (validité de construit) ?</w:t>
+        <w:t xml:space="preserve">healthy worker effect</w:t>
+      </w:r>
+      <w:r>
+        <w:t xml:space="preserve">,</w:t>
+      </w:r>
+      <w:r>
+        <w:t xml:space="preserve"> </w:t>
+      </w:r>
+      <w:r>
+        <w:rPr>
+          <w:b/>
+          <w:bCs/>
+        </w:rPr>
+        <w:t xml:space="preserve">auto-sélection</w:t>
+      </w:r>
+      <w:r>
+        <w:t xml:space="preserve"> </w:t>
+      </w:r>
+      <w:r>
+        <w:t xml:space="preserve">(ex. les personnes en surpoids répondent moins à un questionnaire sur le poids).</w:t>
       </w:r>
     </w:p>
     <w:p>
@@ -928,7 +1397,7 @@
           <w:b/>
           <w:bCs/>
         </w:rPr>
-        <w:t xml:space="preserve">9. Les variables ont-elles été mesurées avec des instruments éprouvés/publiés ?</w:t>
+        <w:t xml:space="preserve">7. Des mesures ont-elles été prises pour traiter/catégoriser les non-répondants ?</w:t>
       </w:r>
       <w:r>
         <w:t xml:space="preserve"> </w:t>
@@ -944,7 +1413,7 @@
           <w:i/>
           <w:iCs/>
         </w:rPr>
-        <w:t xml:space="preserve">Were the risk factor and outcome variables measured correctly using instruments/measurements that had been trialled, piloted or published previously?</w:t>
+        <w:t xml:space="preserve">Were measures undertaken to address and categorise non-responders?</w:t>
       </w:r>
       <w:r>
         <w:t xml:space="preserve"> </w:t>
@@ -956,7 +1425,68 @@
         <w:t xml:space="preserve"> </w:t>
       </w:r>
       <w:r>
-        <w:t xml:space="preserve">→ Instruments validés/pilotés (fiabilité de mesure), sinon risque de biais d'information.</w:t>
+        <w:t xml:space="preserve">→ La non-réponse est difficile à traiter en transversal. Un</w:t>
+      </w:r>
+      <w:r>
+        <w:t xml:space="preserve"> </w:t>
+      </w:r>
+      <w:r>
+        <w:rPr>
+          <w:b/>
+          <w:bCs/>
+        </w:rPr>
+        <w:t xml:space="preserve">non-répondant</w:t>
+      </w:r>
+      <w:r>
+        <w:t xml:space="preserve"> </w:t>
+      </w:r>
+      <w:r>
+        <w:t xml:space="preserve">refuse, est injoignable, ou ne peut être documenté. Des</w:t>
+      </w:r>
+      <w:r>
+        <w:t xml:space="preserve"> </w:t>
+      </w:r>
+      <w:r>
+        <w:rPr>
+          <w:b/>
+          <w:bCs/>
+        </w:rPr>
+        <w:t xml:space="preserve">statistiques de base</w:t>
+      </w:r>
+      <w:r>
+        <w:t xml:space="preserve"> </w:t>
+      </w:r>
+      <w:r>
+        <w:t xml:space="preserve">(âge, sexe, CSP) peuvent servir de comparateur pour juger la représentativité. Les méthodes employées doivent être</w:t>
+      </w:r>
+      <w:r>
+        <w:t xml:space="preserve"> </w:t>
+      </w:r>
+      <w:r>
+        <w:rPr>
+          <w:b/>
+          <w:bCs/>
+        </w:rPr>
+        <w:t xml:space="preserve">bien décrites</w:t>
+      </w:r>
+      <w:r>
+        <w:t xml:space="preserve">. Enjeu : les non-répondants peuvent former un</w:t>
+      </w:r>
+      <w:r>
+        <w:t xml:space="preserve"> </w:t>
+      </w:r>
+      <w:r>
+        <w:rPr>
+          <w:b/>
+          <w:bCs/>
+        </w:rPr>
+        <w:t xml:space="preserve">groupe spécifique</w:t>
+      </w:r>
+      <w:r>
+        <w:t xml:space="preserve"> </w:t>
+      </w:r>
+      <w:r>
+        <w:t xml:space="preserve">→ décalage des données de base.</w:t>
       </w:r>
     </w:p>
     <w:p>
@@ -968,7 +1498,7 @@
           <w:b/>
           <w:bCs/>
         </w:rPr>
-        <w:t xml:space="preserve">10. Est-il clair ce qui a servi à déterminer la significativité/précision (p, IC) ?</w:t>
+        <w:t xml:space="preserve">8. Les variables (exposition/résultat) étaient-elles adaptées aux objectifs ? (Validité)</w:t>
       </w:r>
       <w:r>
         <w:t xml:space="preserve"> </w:t>
@@ -984,19 +1514,51 @@
           <w:i/>
           <w:iCs/>
         </w:rPr>
-        <w:t xml:space="preserve">Is it clear what was used to determine statistical significance and/or precision estimates? (eg, p values, CIs)</w:t>
-      </w:r>
-      <w:r>
-        <w:t xml:space="preserve"> </w:t>
-      </w:r>
-      <w:r>
-        <w:t xml:space="preserve">— [Report]</w:t>
-      </w:r>
-      <w:r>
-        <w:t xml:space="preserve"> </w:t>
-      </w:r>
-      <w:r>
-        <w:t xml:space="preserve">→ Les seuils/estimateurs (p, intervalles de confiance) sont-ils explicités ?</w:t>
+        <w:t xml:space="preserve">Were the risk factor and outcome variables measured appropriate to the aims of the study?</w:t>
+      </w:r>
+      <w:r>
+        <w:t xml:space="preserve"> </w:t>
+      </w:r>
+      <w:r>
+        <w:t xml:space="preserve">— [Design]</w:t>
+      </w:r>
+      <w:r>
+        <w:t xml:space="preserve"> </w:t>
+      </w:r>
+      <w:r>
+        <w:t xml:space="preserve">→ Vise la</w:t>
+      </w:r>
+      <w:r>
+        <w:t xml:space="preserve"> </w:t>
+      </w:r>
+      <w:r>
+        <w:rPr>
+          <w:b/>
+          <w:bCs/>
+        </w:rPr>
+        <w:t xml:space="preserve">validité de mesure</w:t>
+      </w:r>
+      <w:r>
+        <w:t xml:space="preserve"> </w:t>
+      </w:r>
+      <w:r>
+        <w:t xml:space="preserve">: à quel point les mesures évaluent bien les concepts explorés. Des mesures inappropriées →</w:t>
+      </w:r>
+      <w:r>
+        <w:t xml:space="preserve"> </w:t>
+      </w:r>
+      <w:r>
+        <w:rPr>
+          <w:b/>
+          <w:bCs/>
+        </w:rPr>
+        <w:t xml:space="preserve">biais de classification</w:t>
+      </w:r>
+      <w:r>
+        <w:t xml:space="preserve"> </w:t>
+      </w:r>
+      <w:r>
+        <w:t xml:space="preserve">et difficulté à relier les résultats à la population cible.</w:t>
       </w:r>
     </w:p>
     <w:p>
@@ -1008,7 +1570,7 @@
           <w:b/>
           <w:bCs/>
         </w:rPr>
-        <w:t xml:space="preserve">11. Les méthodes (dont statistiques) étaient-elles assez décrites pour être reproduites ?</w:t>
+        <w:t xml:space="preserve">9. Les variables ont-elles été mesurées avec des instruments éprouvés/pilotés/publiés ? (Fiabilité)</w:t>
       </w:r>
       <w:r>
         <w:t xml:space="preserve"> </w:t>
@@ -1024,19 +1586,96 @@
           <w:i/>
           <w:iCs/>
         </w:rPr>
-        <w:t xml:space="preserve">Were the methods (including statistical methods) sufficiently described to enable them to be repeated?</w:t>
-      </w:r>
-      <w:r>
-        <w:t xml:space="preserve"> </w:t>
-      </w:r>
-      <w:r>
-        <w:t xml:space="preserve">— [Report]</w:t>
-      </w:r>
-      <w:r>
-        <w:t xml:space="preserve"> </w:t>
-      </w:r>
-      <w:r>
-        <w:t xml:space="preserve">→ Reproductibilité : un lecteur pourrait-il refaire l'analyse ?</w:t>
+        <w:t xml:space="preserve">Were the risk factor and outcome variables measured correctly using instruments/measurements that had been trialled, piloted or published previously?</w:t>
+      </w:r>
+      <w:r>
+        <w:t xml:space="preserve"> </w:t>
+      </w:r>
+      <w:r>
+        <w:t xml:space="preserve">— [Biais]</w:t>
+      </w:r>
+      <w:r>
+        <w:t xml:space="preserve"> </w:t>
+      </w:r>
+      <w:r>
+        <w:t xml:space="preserve">→ Vise la</w:t>
+      </w:r>
+      <w:r>
+        <w:t xml:space="preserve"> </w:t>
+      </w:r>
+      <w:r>
+        <w:rPr>
+          <w:b/>
+          <w:bCs/>
+        </w:rPr>
+        <w:t xml:space="preserve">fiabilité de mesure</w:t>
+      </w:r>
+      <w:r>
+        <w:t xml:space="preserve"> </w:t>
+      </w:r>
+      <w:r>
+        <w:t xml:space="preserve">(reproductibilité) : les mesures doivent pouvoir être</w:t>
+      </w:r>
+      <w:r>
+        <w:t xml:space="preserve"> </w:t>
+      </w:r>
+      <w:r>
+        <w:rPr>
+          <w:b/>
+          <w:bCs/>
+        </w:rPr>
+        <w:t xml:space="preserve">reproduites</w:t>
+      </w:r>
+      <w:r>
+        <w:t xml:space="preserve"> </w:t>
+      </w:r>
+      <w:r>
+        <w:t xml:space="preserve">et donner des résultats identiques, même réalisées par un autre chercheur. Privilégier des</w:t>
+      </w:r>
+      <w:r>
+        <w:t xml:space="preserve"> </w:t>
+      </w:r>
+      <w:r>
+        <w:rPr>
+          <w:b/>
+          <w:bCs/>
+        </w:rPr>
+        <w:t xml:space="preserve">standards internationalement reconnus</w:t>
+      </w:r>
+      <w:r>
+        <w:t xml:space="preserve"> </w:t>
+      </w:r>
+      <w:r>
+        <w:t xml:space="preserve">; un instrument nouveau doit être</w:t>
+      </w:r>
+      <w:r>
+        <w:t xml:space="preserve"> </w:t>
+      </w:r>
+      <w:r>
+        <w:rPr>
+          <w:b/>
+          <w:bCs/>
+        </w:rPr>
+        <w:t xml:space="preserve">testé</w:t>
+      </w:r>
+      <w:r>
+        <w:t xml:space="preserve">, un questionnaire</w:t>
+      </w:r>
+      <w:r>
+        <w:t xml:space="preserve"> </w:t>
+      </w:r>
+      <w:r>
+        <w:rPr>
+          <w:b/>
+          <w:bCs/>
+        </w:rPr>
+        <w:t xml:space="preserve">piloté</w:t>
+      </w:r>
+      <w:r>
+        <w:t xml:space="preserve"> </w:t>
+      </w:r>
+      <w:r>
+        <w:t xml:space="preserve">avant usage.</w:t>
       </w:r>
     </w:p>
     <w:p>
@@ -1048,7 +1687,7 @@
           <w:b/>
           <w:bCs/>
         </w:rPr>
-        <w:t xml:space="preserve">12. Les données de base étaient-elles décrites adéquatement ?</w:t>
+        <w:t xml:space="preserve">10. Est-il clair ce qui a servi à déterminer la significativité/précision (p, IC) ?</w:t>
       </w:r>
       <w:r>
         <w:t xml:space="preserve"> </w:t>
@@ -1064,7 +1703,7 @@
           <w:i/>
           <w:iCs/>
         </w:rPr>
-        <w:t xml:space="preserve">Were the basic data adequately described?</w:t>
+        <w:t xml:space="preserve">Is it clear what was used to determine statistical significance and/or precision estimates? (eg, p values, CIs)</w:t>
       </w:r>
       <w:r>
         <w:t xml:space="preserve"> </w:t>
@@ -1076,7 +1715,84 @@
         <w:t xml:space="preserve"> </w:t>
       </w:r>
       <w:r>
-        <w:t xml:space="preserve">→ Caractéristiques de l'échantillon (démographie, tableau descriptif) suffisantes.</w:t>
+        <w:t xml:space="preserve">→ Les</w:t>
+      </w:r>
+      <w:r>
+        <w:t xml:space="preserve"> </w:t>
+      </w:r>
+      <w:r>
+        <w:rPr>
+          <w:b/>
+          <w:bCs/>
+        </w:rPr>
+        <w:t xml:space="preserve">méthodes statistiques, logiciels et seuils</w:t>
+      </w:r>
+      <w:r>
+        <w:t xml:space="preserve"> </w:t>
+      </w:r>
+      <w:r>
+        <w:t xml:space="preserve">doivent être</w:t>
+      </w:r>
+      <w:r>
+        <w:t xml:space="preserve"> </w:t>
+      </w:r>
+      <w:r>
+        <w:rPr>
+          <w:b/>
+          <w:bCs/>
+        </w:rPr>
+        <w:t xml:space="preserve">clairement indiqués</w:t>
+      </w:r>
+      <w:r>
+        <w:t xml:space="preserve">, même pour de simples statistiques descriptives. Le seuil est usuellement une</w:t>
+      </w:r>
+      <w:r>
+        <w:t xml:space="preserve"> </w:t>
+      </w:r>
+      <w:r>
+        <w:rPr>
+          <w:b/>
+          <w:bCs/>
+        </w:rPr>
+        <w:t xml:space="preserve">p-value</w:t>
+      </w:r>
+      <w:r>
+        <w:t xml:space="preserve"> </w:t>
+      </w:r>
+      <w:r>
+        <w:t xml:space="preserve">(souvent 0,05 ; un seuil plus élevé accroît le risque de type I). Les</w:t>
+      </w:r>
+      <w:r>
+        <w:t xml:space="preserve"> </w:t>
+      </w:r>
+      <w:r>
+        <w:rPr>
+          <w:b/>
+          <w:bCs/>
+        </w:rPr>
+        <w:t xml:space="preserve">intervalles de confiance</w:t>
+      </w:r>
+      <w:r>
+        <w:t xml:space="preserve"> </w:t>
+      </w:r>
+      <w:r>
+        <w:t xml:space="preserve">(IC 95 % habituel) devraient être déclarés comme indication de</w:t>
+      </w:r>
+      <w:r>
+        <w:t xml:space="preserve"> </w:t>
+      </w:r>
+      <w:r>
+        <w:rPr>
+          <w:b/>
+          <w:bCs/>
+        </w:rPr>
+        <w:t xml:space="preserve">précision</w:t>
+      </w:r>
+      <w:r>
+        <w:t xml:space="preserve"> </w:t>
+      </w:r>
+      <w:r>
+        <w:t xml:space="preserve">(deux IC qui se chevauchent suggèrent l'absence de différence).</w:t>
       </w:r>
     </w:p>
     <w:p>
@@ -1088,7 +1804,7 @@
           <w:b/>
           <w:bCs/>
         </w:rPr>
-        <w:t xml:space="preserve">13. ⚠️ Le taux de réponse soulève-t-il des inquiétudes de biais de non-réponse ?</w:t>
+        <w:t xml:space="preserve">11. Les méthodes (dont statistiques) étaient-elles assez décrites pour être reproduites ?</w:t>
       </w:r>
       <w:r>
         <w:t xml:space="preserve"> </w:t>
@@ -1104,29 +1820,35 @@
           <w:i/>
           <w:iCs/>
         </w:rPr>
-        <w:t xml:space="preserve">Does the response rate raise concerns about non-response bias?</w:t>
-      </w:r>
-      <w:r>
-        <w:t xml:space="preserve"> </w:t>
-      </w:r>
-      <w:r>
-        <w:t xml:space="preserve">— [Biais] —</w:t>
-      </w:r>
-      <w:r>
-        <w:t xml:space="preserve"> </w:t>
-      </w:r>
-      <w:r>
-        <w:rPr>
-          <w:b/>
-          <w:bCs/>
-        </w:rPr>
-        <w:t xml:space="preserve">INVERSÉ : « Oui » = défavorable.</w:t>
-      </w:r>
-      <w:r>
-        <w:t xml:space="preserve"> </w:t>
-      </w:r>
-      <w:r>
-        <w:t xml:space="preserve">→ Un taux de réponse faible / beaucoup d'exclusions → risque de biais. Répondre « Oui » signale un problème.</w:t>
+        <w:t xml:space="preserve">Were the methods (including statistical methods) sufficiently described to enable them to be repeated?</w:t>
+      </w:r>
+      <w:r>
+        <w:t xml:space="preserve"> </w:t>
+      </w:r>
+      <w:r>
+        <w:t xml:space="preserve">— [Report]</w:t>
+      </w:r>
+      <w:r>
+        <w:t xml:space="preserve"> </w:t>
+      </w:r>
+      <w:r>
+        <w:t xml:space="preserve">→ Des sections ou même de petites informations</w:t>
+      </w:r>
+      <w:r>
+        <w:t xml:space="preserve"> </w:t>
+      </w:r>
+      <w:r>
+        <w:rPr>
+          <w:b/>
+          <w:bCs/>
+        </w:rPr>
+        <w:t xml:space="preserve">manquantes</w:t>
+      </w:r>
+      <w:r>
+        <w:t xml:space="preserve"> </w:t>
+      </w:r>
+      <w:r>
+        <w:t xml:space="preserve">peuvent fortement gêner l'interprétation des résultats et de la discussion (on ignore alors si les bonnes méthodes ont été employées).</w:t>
       </w:r>
     </w:p>
     <w:p>
@@ -1138,7 +1860,7 @@
           <w:b/>
           <w:bCs/>
         </w:rPr>
-        <w:t xml:space="preserve">14. Le cas échéant, l'information sur les non-répondants était-elle décrite ?</w:t>
+        <w:t xml:space="preserve">12. Les données de base étaient-elles décrites adéquatement ?</w:t>
       </w:r>
       <w:r>
         <w:t xml:space="preserve"> </w:t>
@@ -1154,19 +1876,64 @@
           <w:i/>
           <w:iCs/>
         </w:rPr>
-        <w:t xml:space="preserve">If appropriate, was information about non-responders described?</w:t>
-      </w:r>
-      <w:r>
-        <w:t xml:space="preserve"> </w:t>
-      </w:r>
-      <w:r>
-        <w:t xml:space="preserve">— [Biais]</w:t>
-      </w:r>
-      <w:r>
-        <w:t xml:space="preserve"> </w:t>
-      </w:r>
-      <w:r>
-        <w:t xml:space="preserve">→ Caractéristiques des non-répondants fournies (pour juger le biais).</w:t>
+        <w:t xml:space="preserve">Were the basic data adequately described?</w:t>
+      </w:r>
+      <w:r>
+        <w:t xml:space="preserve"> </w:t>
+      </w:r>
+      <w:r>
+        <w:t xml:space="preserve">— [Report]</w:t>
+      </w:r>
+      <w:r>
+        <w:t xml:space="preserve"> </w:t>
+      </w:r>
+      <w:r>
+        <w:t xml:space="preserve">→ L'</w:t>
+      </w:r>
+      <w:r>
+        <w:rPr>
+          <w:b/>
+          <w:bCs/>
+        </w:rPr>
+        <w:t xml:space="preserve">analyse descriptive</w:t>
+      </w:r>
+      <w:r>
+        <w:t xml:space="preserve"> </w:t>
+      </w:r>
+      <w:r>
+        <w:t xml:space="preserve">résume les données (échantillon + mesures). Elle montre le</w:t>
+      </w:r>
+      <w:r>
+        <w:t xml:space="preserve"> </w:t>
+      </w:r>
+      <w:r>
+        <w:rPr>
+          <w:b/>
+          <w:bCs/>
+        </w:rPr>
+        <w:t xml:space="preserve">recrutement</w:t>
+      </w:r>
+      <w:r>
+        <w:t xml:space="preserve"> </w:t>
+      </w:r>
+      <w:r>
+        <w:t xml:space="preserve">et si l'échantillon est représentatif ; sinon → estimations</w:t>
+      </w:r>
+      <w:r>
+        <w:t xml:space="preserve"> </w:t>
+      </w:r>
+      <w:r>
+        <w:rPr>
+          <w:b/>
+          <w:bCs/>
+        </w:rPr>
+        <w:t xml:space="preserve">inexactes</w:t>
+      </w:r>
+      <w:r>
+        <w:t xml:space="preserve"> </w:t>
+      </w:r>
+      <w:r>
+        <w:t xml:space="preserve">de prévalence/incidence/facteurs de risque. Les descriptives éclairent aussi les inférences statistiques ultérieures.</w:t>
       </w:r>
     </w:p>
     <w:p>
@@ -1178,7 +1945,7 @@
           <w:b/>
           <w:bCs/>
         </w:rPr>
-        <w:t xml:space="preserve">15. Les résultats étaient-ils cohérents en interne ?</w:t>
+        <w:t xml:space="preserve">13. ⚠️ Le taux de réponse soulève-t-il des inquiétudes de biais de non-réponse ?</w:t>
       </w:r>
       <w:r>
         <w:t xml:space="preserve"> </w:t>
@@ -1194,19 +1961,77 @@
           <w:i/>
           <w:iCs/>
         </w:rPr>
-        <w:t xml:space="preserve">Were the results internally consistent?</w:t>
-      </w:r>
-      <w:r>
-        <w:t xml:space="preserve"> </w:t>
-      </w:r>
-      <w:r>
-        <w:t xml:space="preserve">— [Biais]</w:t>
-      </w:r>
-      <w:r>
-        <w:t xml:space="preserve"> </w:t>
-      </w:r>
-      <w:r>
-        <w:t xml:space="preserve">→ Les chiffres concordent-ils (totaux, sous-groupes, texte vs tableaux) ?</w:t>
+        <w:t xml:space="preserve">Does the response rate raise concerns about non-response bias?</w:t>
+      </w:r>
+      <w:r>
+        <w:t xml:space="preserve"> </w:t>
+      </w:r>
+      <w:r>
+        <w:t xml:space="preserve">— [Biais] —</w:t>
+      </w:r>
+      <w:r>
+        <w:t xml:space="preserve"> </w:t>
+      </w:r>
+      <w:r>
+        <w:rPr>
+          <w:b/>
+          <w:bCs/>
+        </w:rPr>
+        <w:t xml:space="preserve">INVERSÉ : « Oui » = défavorable.</w:t>
+      </w:r>
+      <w:r>
+        <w:t xml:space="preserve"> </w:t>
+      </w:r>
+      <w:r>
+        <w:t xml:space="preserve">→ Exige qu'un</w:t>
+      </w:r>
+      <w:r>
+        <w:t xml:space="preserve"> </w:t>
+      </w:r>
+      <w:r>
+        <w:rPr>
+          <w:b/>
+          <w:bCs/>
+        </w:rPr>
+        <w:t xml:space="preserve">effort de quantification</w:t>
+      </w:r>
+      <w:r>
+        <w:t xml:space="preserve"> </w:t>
+      </w:r>
+      <w:r>
+        <w:t xml:space="preserve">de la non-réponse ait été fait, puis demande au lecteur de juger si le taux de réponse risque d'introduire un</w:t>
+      </w:r>
+      <w:r>
+        <w:t xml:space="preserve"> </w:t>
+      </w:r>
+      <w:r>
+        <w:rPr>
+          <w:b/>
+          <w:bCs/>
+        </w:rPr>
+        <w:t xml:space="preserve">biais de non-réponse</w:t>
+      </w:r>
+      <w:r>
+        <w:t xml:space="preserve"> </w:t>
+      </w:r>
+      <w:r>
+        <w:t xml:space="preserve">(biais qui survient si les non-répondants</w:t>
+      </w:r>
+      <w:r>
+        <w:t xml:space="preserve"> </w:t>
+      </w:r>
+      <w:r>
+        <w:rPr>
+          <w:b/>
+          <w:bCs/>
+        </w:rPr>
+        <w:t xml:space="preserve">diffèrent substantiellement</w:t>
+      </w:r>
+      <w:r>
+        <w:t xml:space="preserve"> </w:t>
+      </w:r>
+      <w:r>
+        <w:t xml:space="preserve">du reste de l'échantillon).</w:t>
       </w:r>
     </w:p>
     <w:p>
@@ -1218,7 +2043,7 @@
           <w:b/>
           <w:bCs/>
         </w:rPr>
-        <w:t xml:space="preserve">16. Les résultats étaient-ils présentés pour toutes les analyses des méthodes ?</w:t>
+        <w:t xml:space="preserve">14. Le cas échéant, l'information sur les non-répondants était-elle décrite ?</w:t>
       </w:r>
       <w:r>
         <w:t xml:space="preserve"> </w:t>
@@ -1234,19 +2059,48 @@
           <w:i/>
           <w:iCs/>
         </w:rPr>
-        <w:t xml:space="preserve">Were the results for the analyses described in the methods, presented?</w:t>
-      </w:r>
-      <w:r>
-        <w:t xml:space="preserve"> </w:t>
-      </w:r>
-      <w:r>
-        <w:t xml:space="preserve">— [Report]</w:t>
-      </w:r>
-      <w:r>
-        <w:t xml:space="preserve"> </w:t>
-      </w:r>
-      <w:r>
-        <w:t xml:space="preserve">→ Pas d'analyse annoncée puis « disparue » (report sélectif).</w:t>
+        <w:t xml:space="preserve">If appropriate, was information about non-responders described?</w:t>
+      </w:r>
+      <w:r>
+        <w:t xml:space="preserve"> </w:t>
+      </w:r>
+      <w:r>
+        <w:t xml:space="preserve">— [Biais]</w:t>
+      </w:r>
+      <w:r>
+        <w:t xml:space="preserve"> </w:t>
+      </w:r>
+      <w:r>
+        <w:t xml:space="preserve">→ Examine si de l'</w:t>
+      </w:r>
+      <w:r>
+        <w:rPr>
+          <w:b/>
+          <w:bCs/>
+        </w:rPr>
+        <w:t xml:space="preserve">information sur les non-répondants</w:t>
+      </w:r>
+      <w:r>
+        <w:t xml:space="preserve"> </w:t>
+      </w:r>
+      <w:r>
+        <w:t xml:space="preserve">était disponible et s'ils étaient</w:t>
+      </w:r>
+      <w:r>
+        <w:t xml:space="preserve"> </w:t>
+      </w:r>
+      <w:r>
+        <w:rPr>
+          <w:b/>
+          <w:bCs/>
+        </w:rPr>
+        <w:t xml:space="preserve">comparables</w:t>
+      </w:r>
+      <w:r>
+        <w:t xml:space="preserve"> </w:t>
+      </w:r>
+      <w:r>
+        <w:t xml:space="preserve">aux répondants — ce qui aide à répondre à l'item 13.</w:t>
       </w:r>
     </w:p>
     <w:p>
@@ -1258,7 +2112,7 @@
           <w:b/>
           <w:bCs/>
         </w:rPr>
-        <w:t xml:space="preserve">17. Les discussions/conclusions étaient-elles justifiées par les résultats ?</w:t>
+        <w:t xml:space="preserve">15. Les résultats étaient-ils cohérents en interne ?</w:t>
       </w:r>
       <w:r>
         <w:t xml:space="preserve"> </w:t>
@@ -1274,19 +2128,67 @@
           <w:i/>
           <w:iCs/>
         </w:rPr>
-        <w:t xml:space="preserve">Were the authors' discussions and conclusions justified by the results?</w:t>
-      </w:r>
-      <w:r>
-        <w:t xml:space="preserve"> </w:t>
-      </w:r>
-      <w:r>
-        <w:t xml:space="preserve">— [Design]</w:t>
-      </w:r>
-      <w:r>
-        <w:t xml:space="preserve"> </w:t>
-      </w:r>
-      <w:r>
-        <w:t xml:space="preserve">→ Les conclusions ne dépassent pas ce que les données montrent (ex. causalité à partir d'un transversal).</w:t>
+        <w:t xml:space="preserve">Were the results internally consistent?</w:t>
+      </w:r>
+      <w:r>
+        <w:t xml:space="preserve"> </w:t>
+      </w:r>
+      <w:r>
+        <w:t xml:space="preserve">— [Biais]</w:t>
+      </w:r>
+      <w:r>
+        <w:t xml:space="preserve"> </w:t>
+      </w:r>
+      <w:r>
+        <w:t xml:space="preserve">→ Le lecteur</w:t>
+      </w:r>
+      <w:r>
+        <w:t xml:space="preserve"> </w:t>
+      </w:r>
+      <w:r>
+        <w:rPr>
+          <w:b/>
+          <w:bCs/>
+        </w:rPr>
+        <w:t xml:space="preserve">explore les nombres</w:t>
+      </w:r>
+      <w:r>
+        <w:t xml:space="preserve"> </w:t>
+      </w:r>
+      <w:r>
+        <w:t xml:space="preserve">(texte, figures, tableaux). Vérifier que</w:t>
+      </w:r>
+      <w:r>
+        <w:t xml:space="preserve"> </w:t>
+      </w:r>
+      <w:r>
+        <w:rPr>
+          <w:b/>
+          <w:bCs/>
+        </w:rPr>
+        <w:t xml:space="preserve">les comptes tombent juste</w:t>
+      </w:r>
+      <w:r>
+        <w:t xml:space="preserve"> </w:t>
+      </w:r>
+      <w:r>
+        <w:t xml:space="preserve">(100 recrutés → tableaux et texte portent sur 100). Les</w:t>
+      </w:r>
+      <w:r>
+        <w:t xml:space="preserve"> </w:t>
+      </w:r>
+      <w:r>
+        <w:rPr>
+          <w:b/>
+          <w:bCs/>
+        </w:rPr>
+        <w:t xml:space="preserve">données manquantes</w:t>
+      </w:r>
+      <w:r>
+        <w:t xml:space="preserve"> </w:t>
+      </w:r>
+      <w:r>
+        <w:t xml:space="preserve">doivent être déclarées et leur absence expliquée.</w:t>
       </w:r>
     </w:p>
     <w:p>
@@ -1298,7 +2200,7 @@
           <w:b/>
           <w:bCs/>
         </w:rPr>
-        <w:t xml:space="preserve">18. Les limites de l'étude ont-elles été discutées ?</w:t>
+        <w:t xml:space="preserve">16. Les résultats étaient-ils présentés pour toutes les analyses des méthodes ?</w:t>
       </w:r>
       <w:r>
         <w:t xml:space="preserve"> </w:t>
@@ -1314,7 +2216,7 @@
           <w:i/>
           <w:iCs/>
         </w:rPr>
-        <w:t xml:space="preserve">Were the limitations of the study discussed?</w:t>
+        <w:t xml:space="preserve">Were the results presented for all the analyses described in the methods?</w:t>
       </w:r>
       <w:r>
         <w:t xml:space="preserve"> </w:t>
@@ -1326,7 +2228,55 @@
         <w:t xml:space="preserve"> </w:t>
       </w:r>
       <w:r>
-        <w:t xml:space="preserve">→ Reconnaissance honnête des limites (design, biais, généralisation).</w:t>
+        <w:t xml:space="preserve">→ Vérifier que</w:t>
+      </w:r>
+      <w:r>
+        <w:t xml:space="preserve"> </w:t>
+      </w:r>
+      <w:r>
+        <w:rPr>
+          <w:b/>
+          <w:bCs/>
+        </w:rPr>
+        <w:t xml:space="preserve">toutes les méthodes décrites</w:t>
+      </w:r>
+      <w:r>
+        <w:t xml:space="preserve"> </w:t>
+      </w:r>
+      <w:r>
+        <w:t xml:space="preserve">débouchent sur des résultats. Des résultats</w:t>
+      </w:r>
+      <w:r>
+        <w:t xml:space="preserve"> </w:t>
+      </w:r>
+      <w:r>
+        <w:rPr>
+          <w:b/>
+          <w:bCs/>
+        </w:rPr>
+        <w:t xml:space="preserve">manquants</w:t>
+      </w:r>
+      <w:r>
+        <w:t xml:space="preserve"> </w:t>
+      </w:r>
+      <w:r>
+        <w:t xml:space="preserve">laissent planer le doute : non-significatifs non décrits, ou</w:t>
+      </w:r>
+      <w:r>
+        <w:t xml:space="preserve"> </w:t>
+      </w:r>
+      <w:r>
+        <w:rPr>
+          <w:b/>
+          <w:bCs/>
+        </w:rPr>
+        <w:t xml:space="preserve">omis</w:t>
+      </w:r>
+      <w:r>
+        <w:t xml:space="preserve"> </w:t>
+      </w:r>
+      <w:r>
+        <w:t xml:space="preserve">(report sélectif). Se méfier de formules comme « tendait vers la significativité ».</w:t>
       </w:r>
     </w:p>
     <w:p>
@@ -1338,7 +2288,7 @@
           <w:b/>
           <w:bCs/>
         </w:rPr>
-        <w:t xml:space="preserve">19. ⚠️ Existait-il des financements/conflits d'intérêts pouvant affecter l'interprétation ?</w:t>
+        <w:t xml:space="preserve">17. Les discussions/conclusions étaient-elles justifiées par les résultats ?</w:t>
       </w:r>
       <w:r>
         <w:t xml:space="preserve"> </w:t>
@@ -1354,56 +2304,335 @@
           <w:i/>
           <w:iCs/>
         </w:rPr>
-        <w:t xml:space="preserve">Were there any funding sources or conflicts of interest that may affect the authors' interpretation of the results?</w:t>
-      </w:r>
-      <w:r>
-        <w:t xml:space="preserve"> </w:t>
-      </w:r>
-      <w:r>
-        <w:t xml:space="preserve">— [Design] —</w:t>
-      </w:r>
-      <w:r>
-        <w:t xml:space="preserve"> </w:t>
-      </w:r>
-      <w:r>
-        <w:rPr>
-          <w:b/>
-          <w:bCs/>
-        </w:rPr>
-        <w:t xml:space="preserve">INVERSÉ : « Oui » = défavorable.</w:t>
-      </w:r>
-      <w:r>
-        <w:t xml:space="preserve"> </w:t>
-      </w:r>
-      <w:r>
-        <w:t xml:space="preserve">→ Un financement/conflit susceptible de biaiser l'interprétation → répondre « Oui » signale un risque. (« Non déclaré » ≠ « Non ».)</w:t>
-      </w:r>
-    </w:p>
-    <w:p>
-      <w:pPr>
-        <w:pStyle w:val="BodyText"/>
-      </w:pPr>
-      <w:r>
-        <w:rPr>
-          <w:b/>
-          <w:bCs/>
-        </w:rPr>
-        <w:t xml:space="preserve">20. Un avis éthique ou le consentement des participants a-t-il été obtenu ?</w:t>
-      </w:r>
-      <w:r>
-        <w:t xml:space="preserve"> </w:t>
-      </w:r>
-      <w:r>
-        <w:t xml:space="preserve">—</w:t>
-      </w:r>
-      <w:r>
-        <w:t xml:space="preserve"> </w:t>
+        <w:t xml:space="preserve">Were the authors' discussions and conclusions justified by the results?</w:t>
+      </w:r>
+      <w:r>
+        <w:t xml:space="preserve"> </w:t>
+      </w:r>
+      <w:r>
+        <w:t xml:space="preserve">— [Design]</w:t>
+      </w:r>
+      <w:r>
+        <w:t xml:space="preserve"> </w:t>
+      </w:r>
+      <w:r>
+        <w:t xml:space="preserve">→ On attend un</w:t>
+      </w:r>
+      <w:r>
+        <w:t xml:space="preserve"> </w:t>
+      </w:r>
+      <w:r>
+        <w:rPr>
+          <w:b/>
+          <w:bCs/>
+        </w:rPr>
+        <w:t xml:space="preserve">résumé discuté en détail</w:t>
+      </w:r>
+      <w:r>
+        <w:t xml:space="preserve"> </w:t>
+      </w:r>
+      <w:r>
+        <w:t xml:space="preserve">des principaux résultats, en considérant l'étude</w:t>
+      </w:r>
+      <w:r>
+        <w:t xml:space="preserve"> </w:t>
+      </w:r>
+      <w:r>
+        <w:rPr>
+          <w:b/>
+          <w:bCs/>
+        </w:rPr>
+        <w:t xml:space="preserve">dans son ensemble</w:t>
+      </w:r>
+      <w:r>
+        <w:t xml:space="preserve">. Une conclusion</w:t>
+      </w:r>
+      <w:r>
+        <w:t xml:space="preserve"> </w:t>
+      </w:r>
+      <w:r>
+        <w:rPr>
+          <w:b/>
+          <w:bCs/>
+        </w:rPr>
+        <w:t xml:space="preserve">plus définitive</w:t>
+      </w:r>
+      <w:r>
+        <w:t xml:space="preserve"> </w:t>
+      </w:r>
+      <w:r>
+        <w:t xml:space="preserve">que ce que l'étude permet peut signaler une mécompréhension ou d'autres intérêts. Points à examiner : discuter</w:t>
+      </w:r>
+      <w:r>
+        <w:t xml:space="preserve"> </w:t>
+      </w:r>
+      <w:r>
+        <w:rPr>
+          <w:b/>
+          <w:bCs/>
+        </w:rPr>
+        <w:t xml:space="preserve">tous</w:t>
+      </w:r>
+      <w:r>
+        <w:t xml:space="preserve"> </w:t>
+      </w:r>
+      <w:r>
+        <w:t xml:space="preserve">les résultats liés à l'objectif (même non significatifs) ;</w:t>
+      </w:r>
+      <w:r>
+        <w:t xml:space="preserve"> </w:t>
+      </w:r>
+      <w:r>
+        <w:rPr>
+          <w:b/>
+          <w:bCs/>
+        </w:rPr>
+        <w:t xml:space="preserve">biais de sélection</w:t>
+      </w:r>
+      <w:r>
+        <w:t xml:space="preserve"> </w:t>
+      </w:r>
+      <w:r>
+        <w:t xml:space="preserve">;</w:t>
+      </w:r>
+      <w:r>
+        <w:t xml:space="preserve"> </w:t>
+      </w:r>
+      <w:r>
+        <w:rPr>
+          <w:b/>
+          <w:bCs/>
+        </w:rPr>
+        <w:t xml:space="preserve">non-réponse</w:t>
+      </w:r>
+      <w:r>
+        <w:t xml:space="preserve"> </w:t>
+      </w:r>
+      <w:r>
+        <w:t xml:space="preserve">;</w:t>
+      </w:r>
+      <w:r>
+        <w:t xml:space="preserve"> </w:t>
+      </w:r>
+      <w:r>
+        <w:rPr>
+          <w:b/>
+          <w:bCs/>
+        </w:rPr>
+        <w:t xml:space="preserve">confusion</w:t>
+      </w:r>
+      <w:r>
+        <w:t xml:space="preserve"> </w:t>
+      </w:r>
+      <w:r>
+        <w:t xml:space="preserve">(</w:t>
       </w:r>
       <w:r>
         <w:rPr>
           <w:i/>
           <w:iCs/>
         </w:rPr>
+        <w:t xml:space="preserve">confounding</w:t>
+      </w:r>
+      <w:r>
+        <w:t xml:space="preserve"> </w:t>
+      </w:r>
+      <w:r>
+        <w:t xml:space="preserve">— menace majeure aux inférences cause-effet : une variable paraît causale seulement parce qu'associée à un vrai facteur non mesuré) ;</w:t>
+      </w:r>
+      <w:r>
+        <w:t xml:space="preserve"> </w:t>
+      </w:r>
+      <w:r>
+        <w:rPr>
+          <w:b/>
+          <w:bCs/>
+        </w:rPr>
+        <w:t xml:space="preserve">résultats non significatifs</w:t>
+      </w:r>
+      <w:r>
+        <w:t xml:space="preserve"> </w:t>
+      </w:r>
+      <w:r>
+        <w:t xml:space="preserve">(peuvent tenir au design ou à une taille trop faible).</w:t>
+      </w:r>
+    </w:p>
+    <w:p>
+      <w:pPr>
+        <w:pStyle w:val="BodyText"/>
+      </w:pPr>
+      <w:r>
+        <w:rPr>
+          <w:b/>
+          <w:bCs/>
+        </w:rPr>
+        <w:t xml:space="preserve">18. Les limites de l'étude ont-elles été discutées ?</w:t>
+      </w:r>
+      <w:r>
+        <w:t xml:space="preserve"> </w:t>
+      </w:r>
+      <w:r>
+        <w:t xml:space="preserve">—</w:t>
+      </w:r>
+      <w:r>
+        <w:t xml:space="preserve"> </w:t>
+      </w:r>
+      <w:r>
+        <w:rPr>
+          <w:i/>
+          <w:iCs/>
+        </w:rPr>
+        <w:t xml:space="preserve">Were the limitations of the study discussed?</w:t>
+      </w:r>
+      <w:r>
+        <w:t xml:space="preserve"> </w:t>
+      </w:r>
+      <w:r>
+        <w:t xml:space="preserve">— [Report]</w:t>
+      </w:r>
+      <w:r>
+        <w:t xml:space="preserve"> </w:t>
+      </w:r>
+      <w:r>
+        <w:t xml:space="preserve">→ Toute recherche a des limites. La question : le chercheur</w:t>
+      </w:r>
+      <w:r>
+        <w:t xml:space="preserve"> </w:t>
+      </w:r>
+      <w:r>
+        <w:rPr>
+          <w:b/>
+          <w:bCs/>
+        </w:rPr>
+        <w:t xml:space="preserve">comprend-il</w:t>
+      </w:r>
+      <w:r>
+        <w:t xml:space="preserve"> </w:t>
+      </w:r>
+      <w:r>
+        <w:t xml:space="preserve">celles de son devis ? Si ce point n'est pas exploré, on peut craindre une</w:t>
+      </w:r>
+      <w:r>
+        <w:t xml:space="preserve"> </w:t>
+      </w:r>
+      <w:r>
+        <w:rPr>
+          <w:b/>
+          <w:bCs/>
+        </w:rPr>
+        <w:t xml:space="preserve">compréhension globale faible</w:t>
+      </w:r>
+      <w:r>
+        <w:t xml:space="preserve"> </w:t>
+      </w:r>
+      <w:r>
+        <w:t xml:space="preserve">de l'étude.</w:t>
+      </w:r>
+    </w:p>
+    <w:p>
+      <w:pPr>
+        <w:pStyle w:val="BodyText"/>
+      </w:pPr>
+      <w:r>
+        <w:rPr>
+          <w:b/>
+          <w:bCs/>
+        </w:rPr>
+        <w:t xml:space="preserve">19. ⚠️ Existait-il des financements/conflits d'intérêts pouvant affecter l'interprétation ?</w:t>
+      </w:r>
+      <w:r>
+        <w:t xml:space="preserve"> </w:t>
+      </w:r>
+      <w:r>
+        <w:t xml:space="preserve">—</w:t>
+      </w:r>
+      <w:r>
+        <w:t xml:space="preserve"> </w:t>
+      </w:r>
+      <w:r>
+        <w:rPr>
+          <w:i/>
+          <w:iCs/>
+        </w:rPr>
+        <w:t xml:space="preserve">Were there any funding sources or conflicts of interest that may affect the authors' interpretation of the results?</w:t>
+      </w:r>
+      <w:r>
+        <w:t xml:space="preserve"> </w:t>
+      </w:r>
+      <w:r>
+        <w:t xml:space="preserve">— [Design] —</w:t>
+      </w:r>
+      <w:r>
+        <w:t xml:space="preserve"> </w:t>
+      </w:r>
+      <w:r>
+        <w:rPr>
+          <w:b/>
+          <w:bCs/>
+        </w:rPr>
+        <w:t xml:space="preserve">INVERSÉ : « Oui » = défavorable.</w:t>
+      </w:r>
+      <w:r>
+        <w:t xml:space="preserve"> </w:t>
+      </w:r>
+      <w:r>
+        <w:t xml:space="preserve">→ Il est très important que</w:t>
+      </w:r>
+      <w:r>
+        <w:t xml:space="preserve"> </w:t>
+      </w:r>
+      <w:r>
+        <w:rPr>
+          <w:b/>
+          <w:bCs/>
+        </w:rPr>
+        <w:t xml:space="preserve">conflits d'intérêts et financements</w:t>
+      </w:r>
+      <w:r>
+        <w:t xml:space="preserve"> </w:t>
+      </w:r>
+      <w:r>
+        <w:t xml:space="preserve">soient déclarés. Un financement par une agence peut, même</w:t>
+      </w:r>
+      <w:r>
+        <w:t xml:space="preserve"> </w:t>
+      </w:r>
+      <w:r>
+        <w:rPr>
+          <w:b/>
+          <w:bCs/>
+        </w:rPr>
+        <w:t xml:space="preserve">inconsciemment</w:t>
+      </w:r>
+      <w:r>
+        <w:t xml:space="preserve">, orienter l'interprétation en faveur de ses intérêts. Au lecteur de juger si ces conflits sont pertinents. (« Non déclaré » ≠ « Non ».)</w:t>
+      </w:r>
+    </w:p>
+    <w:p>
+      <w:pPr>
+        <w:pStyle w:val="BodyText"/>
+      </w:pPr>
+      <w:r>
+        <w:rPr>
+          <w:b/>
+          <w:bCs/>
+        </w:rPr>
+        <w:t xml:space="preserve">20. Un avis éthique ou le consentement des participants a-t-il été obtenu ?</w:t>
+      </w:r>
+      <w:r>
+        <w:t xml:space="preserve"> </w:t>
+      </w:r>
+      <w:r>
+        <w:t xml:space="preserve">—</w:t>
+      </w:r>
+      <w:r>
+        <w:t xml:space="preserve"> </w:t>
+      </w:r>
+      <w:r>
+        <w:rPr>
+          <w:i/>
+          <w:iCs/>
+        </w:rPr>
         <w:t xml:space="preserve">Was ethical approval or consent of participants attained?</w:t>
       </w:r>
       <w:r>
@@ -1416,17 +2645,62 @@
         <w:t xml:space="preserve"> </w:t>
       </w:r>
       <w:r>
-        <w:t xml:space="preserve">→ Approbation d'un comité d'éthique (IRB) et/ou consentement.</w:t>
-      </w:r>
-    </w:p>
-    <w:bookmarkEnd w:id="12"/>
-    <w:bookmarkStart w:id="13" w:name="comment-lapp-applique-axis"/>
+        <w:t xml:space="preserve">→ Approbation d'un</w:t>
+      </w:r>
+      <w:r>
+        <w:t xml:space="preserve"> </w:t>
+      </w:r>
+      <w:r>
+        <w:rPr>
+          <w:b/>
+          <w:bCs/>
+        </w:rPr>
+        <w:t xml:space="preserve">comité d'éthique</w:t>
+      </w:r>
+      <w:r>
+        <w:t xml:space="preserve"> </w:t>
+      </w:r>
+      <w:r>
+        <w:t xml:space="preserve">et/ou</w:t>
+      </w:r>
+      <w:r>
+        <w:t xml:space="preserve"> </w:t>
+      </w:r>
+      <w:r>
+        <w:rPr>
+          <w:b/>
+          <w:bCs/>
+        </w:rPr>
+        <w:t xml:space="preserve">consentement</w:t>
+      </w:r>
+      <w:r>
+        <w:t xml:space="preserve">, qui doivent être obtenus</w:t>
+      </w:r>
+      <w:r>
+        <w:t xml:space="preserve"> </w:t>
+      </w:r>
+      <w:r>
+        <w:rPr>
+          <w:b/>
+          <w:bCs/>
+        </w:rPr>
+        <w:t xml:space="preserve">avant</w:t>
+      </w:r>
+      <w:r>
+        <w:t xml:space="preserve"> </w:t>
+      </w:r>
+      <w:r>
+        <w:t xml:space="preserve">toute recherche sur un animal ou une personne.</w:t>
+      </w:r>
+    </w:p>
+    <w:bookmarkEnd w:id="13"/>
+    <w:bookmarkStart w:id="14" w:name="comment-scienceswiki-applique-axis"/>
     <w:p>
       <w:pPr>
         <w:pStyle w:val="Heading2"/>
       </w:pPr>
       <w:r>
-        <w:t xml:space="preserve">Comment l'app applique AXIS</w:t>
+        <w:t xml:space="preserve">Comment SciencesWiki applique AXIS</w:t>
       </w:r>
     </w:p>
     <w:p>
@@ -1529,7 +2803,7 @@
         </w:numPr>
       </w:pPr>
       <w:r>
-        <w:t xml:space="preserve">Le score de fiabilité = part d'items</w:t>
+        <w:t xml:space="preserve">Score de fiabilité = part d'items</w:t>
       </w:r>
       <w:r>
         <w:t xml:space="preserve"> </w:t>
@@ -1561,13 +2835,35 @@
         <w:t xml:space="preserve"> </w:t>
       </w:r>
       <w:r>
-        <w:t xml:space="preserve">(hors « non applicable »</w:t>
-      </w:r>
-      <w:r>
-        <w:t xml:space="preserve"> </w:t>
-      </w:r>
-      <w:r>
-        <w:t xml:space="preserve">et « indéterminé »). Items 13 et 19 inversés (un « Oui » n'est pas favorable).</w:t>
+        <w:t xml:space="preserve">(hors « non applicable » et</w:t>
+      </w:r>
+      <w:r>
+        <w:t xml:space="preserve"> </w:t>
+      </w:r>
+      <w:r>
+        <w:t xml:space="preserve">« indéterminé »). Items</w:t>
+      </w:r>
+      <w:r>
+        <w:t xml:space="preserve"> </w:t>
+      </w:r>
+      <w:r>
+        <w:rPr>
+          <w:b/>
+          <w:bCs/>
+        </w:rPr>
+        <w:t xml:space="preserve">13 et 19 inversés</w:t>
+      </w:r>
+      <w:r>
+        <w:t xml:space="preserve"> </w:t>
+      </w:r>
+      <w:r>
+        <w:t xml:space="preserve">(un « Oui » n'est pas favorable). « Partiellement »</w:t>
+      </w:r>
+      <w:r>
+        <w:t xml:space="preserve"> </w:t>
+      </w:r>
+      <w:r>
+        <w:t xml:space="preserve">compte comme évaluable non favorable.</w:t>
       </w:r>
     </w:p>
     <w:p>
@@ -1579,7 +2875,7 @@
         </w:numPr>
       </w:pPr>
       <w:r>
-        <w:t xml:space="preserve">Garde-fou : les réponses défavorables sont marquées « ancrées » si une</w:t>
+        <w:t xml:space="preserve">Garde-fou : une réponse défavorable est marquée « ancrée » si une</w:t>
       </w:r>
       <w:r>
         <w:t xml:space="preserve"> </w:t>
@@ -1595,11 +2891,17 @@
         <w:t xml:space="preserve"> </w:t>
       </w:r>
       <w:r>
-        <w:t xml:space="preserve">est retrouvée dans le texte ; sinon la réflexion du modèle reste affichée (traçabilité).</w:t>
-      </w:r>
-    </w:p>
-    <w:bookmarkEnd w:id="13"/>
-    <w:bookmarkStart w:id="16" w:name="sources"/>
+        <w:t xml:space="preserve">est</w:t>
+      </w:r>
+      <w:r>
+        <w:t xml:space="preserve"> </w:t>
+      </w:r>
+      <w:r>
+        <w:t xml:space="preserve">retrouvée dans le texte ; sinon la réflexion du modèle reste affichée (traçabilité).</w:t>
+      </w:r>
+    </w:p>
+    <w:bookmarkEnd w:id="14"/>
+    <w:bookmarkStart w:id="17" w:name="sources"/>
     <w:p>
       <w:pPr>
         <w:pStyle w:val="Heading2"/>
@@ -1655,7 +2957,7 @@
       <w:r>
         <w:t xml:space="preserve"> </w:t>
       </w:r>
-      <w:hyperlink r:id="rId14">
+      <w:hyperlink r:id="rId15">
         <w:r>
           <w:rPr>
             <w:rStyle w:val="Hyperlink"/>
@@ -1673,12 +2975,40 @@
         </w:numPr>
       </w:pPr>
       <w:r>
+        <w:t xml:space="preserve">Grille des 20 items + texte d'aide :</w:t>
+      </w:r>
+      <w:r>
+        <w:t xml:space="preserve"> </w:t>
+      </w:r>
+      <w:r>
+        <w:rPr>
+          <w:i/>
+          <w:iCs/>
+        </w:rPr>
+        <w:t xml:space="preserve">supplementary material 2</w:t>
+      </w:r>
+      <w:r>
+        <w:t xml:space="preserve"> </w:t>
+      </w:r>
+      <w:r>
+        <w:t xml:space="preserve">de l'article (DC2).</w:t>
+      </w:r>
+    </w:p>
+    <w:p>
+      <w:pPr>
+        <w:pStyle w:val="Compact"/>
+        <w:numPr>
+          <w:ilvl w:val="0"/>
+          <w:numId w:val="1004"/>
+        </w:numPr>
+      </w:pPr>
+      <w:r>
         <w:t xml:space="preserve">Page auteurs (CEVM, Univ. Nottingham) :</w:t>
       </w:r>
       <w:r>
         <w:t xml:space="preserve"> </w:t>
       </w:r>
-      <w:hyperlink r:id="rId15">
+      <w:hyperlink r:id="rId16">
         <w:r>
           <w:rPr>
             <w:rStyle w:val="Hyperlink"/>
@@ -1687,8 +3017,8 @@
         </w:r>
       </w:hyperlink>
     </w:p>
-    <w:bookmarkEnd w:id="16"/>
     <w:bookmarkEnd w:id="17"/>
+    <w:bookmarkEnd w:id="18"/>
     <w:sectPr>
       <w:footnotePr>
         <w:numRestart w:val="eachSect"/>

</xml_diff>